<commit_message>
Simplify scheduling and add weekly doctor blocks
</commit_message>
<xml_diff>
--- a/docs/Dental_Scheduler_Product_SOP.docx
+++ b/docs/Dental_Scheduler_Product_SOP.docx
@@ -3174,11 +3174,7 @@
         <w:ind w:left="540" w:hanging="271"/>
       </w:pPr>
       <w:r>
-        <w:rPr>
-          <w:rFonts w:ascii="Calibri" w:hAnsi="Calibri"/>
-          <w:color w:val="0B2545"/>
-        </w:rPr>
-        <w:t>Enter verified identity, procedure, minimum context, complexity, and realistic remaining availability.</w:t>
+        <w:t>Enter verified identity and clinician-approved procedure. Leave the any-opening assumption selected for the basic flow; add minimum context, complexity, preferences, or realistic remaining availability only when applicable.</w:t>
       </w:r>
     </w:p>
     <w:p>
@@ -7209,6 +7205,29 @@
         <w:t>End of standard operating procedure.</w:t>
       </w:r>
     </w:p>
+    <w:p>
+      <w:pPr>
+        <w:pStyle w:val="Heading1"/>
+      </w:pPr>
+      <w:r>
+        <w:t>Simplified Scheduling Procedure</w:t>
+      </w:r>
+    </w:p>
+    <w:p>
+      <w:r>
+        <w:t>In Schedule patient, identify the existing or new patient and select the clinician-approved treatment. Continue to Preferences with Patient can take any available opening selected. Turn it off only when the patient gave actual date or daily-time limits. Review optional dentist, waitlist, walk-in, and authorized block-override controls, then find and review a complete resource plan before confirmation.</w:t>
+      </w:r>
+    </w:p>
+    <w:p>
+      <w:r>
+        <w:t>In Settings under Doctor blocks, select a dentist, procedure, first start and end, and operational reason. Add a weekly repeat-through date only when the same local block should recur. The full series fails safely if any occurrence is unusable. Release an occurrence with a reason; do not edit or delete block history. Confirmed appointments never move when blocks are created or released.</w:t>
+      </w:r>
+    </w:p>
+    <w:p>
+      <w:r>
+        <w:t>For a basic simulation, upload only request_id, patient_ref, and procedure_code. Use opaque identifiers. The system supplies standard complexity, routine priority, and any-opening availability. Add advanced columns only when the scenario requires them. Preview before running, and treat outputs as hypothetical production opportunity rather than appointments or realized revenue.</w:t>
+      </w:r>
+    </w:p>
     <w:sectPr>
       <w:headerReference w:type="default" r:id="rId9"/>
       <w:footerReference w:type="default" r:id="rId10"/>

</xml_diff>